<commit_message>
adaptacion del nuevo flujo y logica 2
</commit_message>
<xml_diff>
--- a/docs/AcaPlan_PWA_Traspaso_para_Gemini.docx
+++ b/docs/AcaPlan_PWA_Traspaso_para_Gemini.docx
@@ -20,7 +20,7 @@
     </w:p>
     <w:p>
       <w:r>
-        <w:t>Estado actualizado el 11 de octubre de 2026. Diagnóstico local adaptado y protección de turnos con clases desplegada. La migración completa del flujo compartido sigue pendiente.</w:t>
+        <w:t>Estado actualizado el 11 de octubre de 2026. Registro de restricciones comunicadas integrado como avance parcial del Sprint 3. Los sprints 1 y 2 no se declaran cerrados con el flujo nuevo.</w:t>
       </w:r>
     </w:p>
     <w:p>
@@ -805,7 +805,7 @@
     </w:p>
     <w:p>
       <w:r>
-        <w:t>Nuevo contrato local del diagnóstico: cuadriculas y gruposTurnos determinan el turno del grupo; cada clase declara id_bloques de su sesión. restricciones debe ser una lista explícita de intervalos no disponibles ya autorizados, con id_docente, id_periodo, dia, hora_inicio y hora_fin. Una lista vacía permite continuar, pero una lista ausente o inválida impide validar. No se convierte disponibilidad histórica en restricciones. Estos campos no constituyen una tabla o RPC ya desplegada.</w:t>
+        <w:t>Contrato local del diagnóstico: cuadriculas y gruposTurnos determinan el turno; cada clase declara id_bloques de su sesión. restricciones contiene intervalos no disponibles con id_docente, id_periodo, dia, hora_inicio y hora_fin. La tabla nueva añade activa: las retiradas no bloquean. [] significa ausencia de restricciones; una consulta ausente o datos inválidos impiden validar. La RPC y pantalla ya guardan estos registros, pero aún falta conectarlos con las escrituras/validaciones de horarios compartidas.</w:t>
       </w:r>
     </w:p>
     <w:p>
@@ -824,6 +824,11 @@
       </w:r>
     </w:p>
     <w:p>
+      <w:r>
+        <w:t>Registro de restricciones: frontend/src/features/management/RestriccionesPanel.jsx, backend/src/restriction-input.js y rutas GET/POST /api/restricciones. La RPC valida función institucional en servidor y rechaza sobrescrituras con versión antigua. El formulario se descarta al cambiar semestre o permisos; tras un error de guardado exige recargar. No reprograma clases ni activa el motor. La móvil mantiene su disponibilidad histórica y no consume todavía el nuevo registro; se adaptará junto con la integración de horarios.</w:t>
+      </w:r>
+    </w:p>
+    <w:p>
       <w:pPr>
         <w:pStyle w:val="Heading2"/>
       </w:pPr>
@@ -838,7 +843,7 @@
     </w:p>
     <w:p>
       <w:r>
-        <w:t>El permiso para que los jefes editen disponibilidad cambió previamente en Supabase, pero la persistencia aún usa intervalos positivos. La PWA ya retiró ese formulario. El menú Restricciones explica el nuevo proceso y deja la disponibilidad anterior como consulta desplegable. Falta implementar restricciones comunicadas; no invertir automáticamente el significado de los datos anteriores.</w:t>
+        <w:t>El registro de restricciones comunicadas ya tiene tabla separada pwa_restricciones_docentes y RPC pwa_restricciones_api, desplegadas mediante sprint-3-restricciones-comunicadas.sql. La PWA permite alta, corrección y retirada sin borrar. Administradores y jefes editan; coordinadores y docentes consultan. Se conserva autor, último editor, fecha y versión. La disponibilidad positiva anterior permanece separada y solo se consulta en la PWA.</w:t>
       </w:r>
     </w:p>
     <w:p>
@@ -853,7 +858,7 @@
     </w:p>
     <w:p>
       <w:r>
-        <w:t>Verificación de este punto: 92 pruebas de backend y 53 de interfaz aprobadas, lint sin errores y compilación correcta. test-proteger-turnos.mjs comprobó localmente la protección SQL, su repetibilidad y rollback. Supabase confirmó la ejecución y el trigger activo. No se crearon registros de prueba en producción; la concurrencia multiconexión no se probó con PGlite.</w:t>
+        <w:t>Verificación al 12 de octubre: 97 pruebas de backend y 66 de interfaz aprobadas (suite completa y una prueba focalizada adicional), lint, compilación y arranque correctos. Quince escenarios SQL locales incluyeron identidad de grupos por carrera y semestre. La suite SQL también prueba contratos históricos; no demuestra la adaptación completa al nuevo flujo. No se crearon datos de prueba en producción.</w:t>
       </w:r>
     </w:p>
     <w:p>
@@ -1284,6 +1289,26 @@
       </w:tr>
     </w:tbl>
     <w:p>
+      <w:r>
+        <w:t>Estado por sprint: Sprint 1 abierto: además de aceptación real, falta resolver la identificación cédula/INSS (actualmente se exige cédula). Sprint 2 abierto: importación del inventario, datos completos de grupos (modalidad/sede e identidad por carrera), excepciones autorizadas y revalidación de clases persistidas. Sprint 3 conserva únicamente avances parciales. No presentar ninguno de estos pendientes como resuelto por pruebas unitarias.</w:t>
+      </w:r>
+    </w:p>
+    <w:p>
+      <w:r>
+        <w:t>Correcciones del 11 de octubre: cuentas y semestres distinguen un fallo de consulta de una lista vacía y permiten reintentar. Se descarta el formulario de semestre al perder permisos y el alta de cuenta si deja de estar habilitada. Al cambiar de perfil, el panel no reutiliza los permisos anteriores. En Supabase se actualizó proteger_turno_con_clases para devolver los IDs afectados; no cambia sus condiciones de bloqueo ni los permisos, ni modifica horarios. La PWA muestra estos IDs de manera limitada y segura. No fue necesario modificar la app móvil. Consultar docs/sprint-1.md y docs/sprint-2.md para el estado de aceptación. Compartir aparte el SQL ignorado por Git si se prepara otra base.</w:t>
+      </w:r>
+    </w:p>
+    <w:p>
+      <w:r>
+        <w:t>Incremento del 12 de octubre: Grupos permite combinar búsqueda, carrera, año y turno, incluido sin turno asignado. Distingue códigos repetidos y guarda por ID y versión; marca la cantidad de estudiantes ausente como pendiente y descarta selecciones al cambiar permisos. Los fallos de consulta permiten reintentar sin simular una lista vacía. En correcciones de aulas, la API de la PWA exige tipo y lista de recursos explícitos: omitirlos no convierte el tipo ni retira equipamiento. Se descarta el formulario al perder permiso. No hubo cambios en Supabase ni en móvil. Se mantiene abierto Sprint 2: faltan modalidad/sede, importaciones definitivas, excepciones y revalidación. El criterio de identidad por carrera/semestre sí quedó comprobado en SQL local; falta su aceptación en el entorno compartido.</w:t>
+      </w:r>
+    </w:p>
+    <w:p>
+      <w:r>
+        <w:t>Navegación ajustada al flujo acordado: se retiraron las entradas independientes Grupos, Demanda de carga y Bloques y recesos. Asignación académica reúne Asignaturas y docentes con Años de carrera y turnos; explica la recepción por Excel, revisión y futura generación. El usuario aclaró que hay un único grupo de estudiantes por año de carrera, no secciones A/B/C. La configuración de tiempos está dentro de Semestres y se ofrece a quienes tienen permiso para gestionarla. Los descansos se consideran intervalos sin clase, no asignaturas ni filas obligatorias del horario publicado. No se cambia el esquema ni se fusionan registros existentes: la reorganización es de interfaz. La carga definitiva de Excel y la generación continúan pendientes.</w:t>
+      </w:r>
+    </w:p>
+    <w:p>
       <w:pPr>
         <w:pStyle w:val="Heading2"/>
       </w:pPr>
@@ -1328,7 +1353,7 @@
         <w:pStyle w:val="ListNumber"/>
       </w:pPr>
       <w:r>
-        <w:t>Migrar la semántica de restricciones comunicadas, con permisos de jefes y administradores. Conservar el significado de los datos existentes y verificar el efecto sobre la móvil.</w:t>
+        <w:t>Conectar el registro nuevo de restricciones con la validación transaccional de horarios y adaptar su consumo móvil antes de sustituir la disponibilidad positiva compartida. Registrar intervalos no equivale a haber migrado todas las reglas. Faltan también clases obligatoriamente juntas y excepciones autorizadas.</w:t>
       </w:r>
     </w:p>
     <w:p>

</xml_diff>